<commit_message>
fix: sidebar footer-heading->sidebar-heading in about/services/download, add image to contact ProfessionalService schema
</commit_message>
<xml_diff>
--- a/downloads/inspection-booking-form.docx
+++ b/downloads/inspection-booking-form.docx
@@ -620,19 +620,7 @@
                 <w:sz w:val="20"/>
                 <w:lang w:eastAsia="zh-CN"/>
               </w:rPr>
-              <w:t>:</w:t>
-            </w:r>
-            <w:r>
-              <w:rPr>
-                <w:rFonts w:ascii="Arial" w:hAnsi="Arial" w:cs="Arial" w:hint="eastAsia"/>
-                <w:b/>
-                <w:bCs/>
-                <w:smallCaps/>
-                <w:spacing w:val="-2"/>
-                <w:sz w:val="20"/>
-                <w:lang w:eastAsia="zh-CN"/>
-              </w:rPr>
-              <w:t xml:space="preserve">          </w:t>
+              <w:t xml:space="preserve">:          </w:t>
             </w:r>
           </w:p>
         </w:tc>
@@ -650,7 +638,7 @@
               <w:spacing w:line="264" w:lineRule="auto"/>
               <w:jc w:val="both"/>
               <w:rPr>
-                <w:rFonts w:ascii="Arial" w:eastAsia="PMingLiU" w:hAnsi="Arial" w:cs="Arial" w:hint="eastAsia"/>
+                <w:rFonts w:ascii="Arial" w:eastAsia="PMingLiU" w:hAnsi="Arial" w:cs="Arial"/>
                 <w:b/>
                 <w:bCs/>
                 <w:smallCaps/>
@@ -753,7 +741,7 @@
               <w:spacing w:line="264" w:lineRule="auto"/>
               <w:jc w:val="both"/>
               <w:rPr>
-                <w:rFonts w:ascii="Arial" w:hAnsi="Arial" w:cs="Arial" w:hint="eastAsia"/>
+                <w:rFonts w:ascii="Arial" w:hAnsi="Arial" w:cs="Arial"/>
                 <w:bCs/>
                 <w:sz w:val="20"/>
                 <w:lang w:eastAsia="zh-CN"/>
@@ -2260,9 +2248,28 @@
                 <w:rFonts w:ascii="Arial" w:hAnsi="Arial" w:cs="Arial"/>
                 <w:sz w:val="18"/>
                 <w:szCs w:val="18"/>
+                <w:lang w:eastAsia="zh-CN"/>
+              </w:rPr>
+              <w:t>T</w:t>
+            </w:r>
+            <w:r>
+              <w:rPr>
+                <w:rFonts w:ascii="Arial" w:hAnsi="Arial" w:cs="Arial" w:hint="eastAsia"/>
+                <w:sz w:val="18"/>
+                <w:szCs w:val="18"/>
+                <w:lang w:eastAsia="zh-CN"/>
+              </w:rPr>
+              <w:t xml:space="preserve">otal </w:t>
+            </w:r>
+            <w:r>
+              <w:rPr>
+                <w:rFonts w:ascii="Arial" w:hAnsi="Arial" w:cs="Arial"/>
+                <w:sz w:val="18"/>
+                <w:szCs w:val="18"/>
               </w:rPr>
               <w:t xml:space="preserve">Quantity </w:t>
             </w:r>
+            <w:proofErr w:type="gramStart"/>
             <w:r>
               <w:rPr>
                 <w:rFonts w:ascii="PMingLiU" w:hAnsi="PMingLiU" w:cs="Arial" w:hint="eastAsia"/>
@@ -2290,6 +2297,7 @@
               </w:rPr>
               <w:t>:</w:t>
             </w:r>
+            <w:proofErr w:type="gramEnd"/>
           </w:p>
         </w:tc>
         <w:tc>
@@ -2440,22 +2448,6 @@
           <w:lang w:eastAsia="zh-CN"/>
         </w:rPr>
         <w:t>explicit</w:t>
-      </w:r>
-      <w:r>
-        <w:rPr>
-          <w:rFonts w:ascii="Arial" w:hAnsi="Arial" w:cs="Arial"/>
-          <w:sz w:val="20"/>
-          <w:lang w:eastAsia="zh-CN"/>
-        </w:rPr>
-        <w:t xml:space="preserve">, </w:t>
-      </w:r>
-      <w:r>
-        <w:rPr>
-          <w:rFonts w:ascii="Arial" w:hAnsi="Arial" w:cs="Arial" w:hint="eastAsia"/>
-          <w:sz w:val="20"/>
-          <w:lang w:eastAsia="zh-CN"/>
-        </w:rPr>
-        <w:t>地址请尽可能详细</w:t>
       </w:r>
       <w:r>
         <w:rPr>
@@ -2488,8 +2480,8 @@
       </w:tblPr>
       <w:tblGrid>
         <w:gridCol w:w="1418"/>
-        <w:gridCol w:w="387"/>
-        <w:gridCol w:w="1525"/>
+        <w:gridCol w:w="22"/>
+        <w:gridCol w:w="1890"/>
         <w:gridCol w:w="900"/>
         <w:gridCol w:w="2160"/>
         <w:gridCol w:w="630"/>
@@ -2734,7 +2726,7 @@
         </w:trPr>
         <w:tc>
           <w:tcPr>
-            <w:tcW w:w="1805" w:type="dxa"/>
+            <w:tcW w:w="1440" w:type="dxa"/>
             <w:gridSpan w:val="2"/>
             <w:vAlign w:val="bottom"/>
           </w:tcPr>
@@ -2745,10 +2737,10 @@
               </w:tabs>
               <w:spacing w:before="120"/>
               <w:rPr>
-                <w:rFonts w:ascii="Arial" w:hAnsi="Arial" w:cs="Arial"/>
-                <w:sz w:val="18"/>
-                <w:szCs w:val="18"/>
-                <w:lang w:eastAsia="zh-TW"/>
+                <w:rFonts w:ascii="Arial" w:hAnsi="Arial" w:cs="Arial" w:hint="eastAsia"/>
+                <w:sz w:val="18"/>
+                <w:szCs w:val="18"/>
+                <w:lang w:eastAsia="zh-CN"/>
               </w:rPr>
             </w:pPr>
             <w:r>
@@ -2764,74 +2756,23 @@
                 <w:rFonts w:ascii="Arial" w:hAnsi="Arial" w:cs="Arial" w:hint="eastAsia"/>
                 <w:sz w:val="18"/>
                 <w:szCs w:val="18"/>
-                <w:lang w:eastAsia="zh-CN"/>
-              </w:rPr>
-              <w:t>:</w:t>
-            </w:r>
-            <w:r>
-              <w:rPr>
-                <w:rFonts w:ascii="Arial" w:hAnsi="Arial" w:cs="Arial"/>
-                <w:sz w:val="18"/>
-                <w:szCs w:val="18"/>
-                <w:lang w:eastAsia="zh-TW"/>
-              </w:rPr>
-              <w:t xml:space="preserve">    </w:t>
-            </w:r>
-          </w:p>
-          <w:p>
-            <w:pPr>
-              <w:tabs>
-                <w:tab w:val="left" w:pos="1715"/>
-              </w:tabs>
-              <w:spacing w:before="120"/>
-              <w:rPr>
-                <w:rFonts w:ascii="Arial" w:hAnsi="Arial" w:cs="Arial"/>
-                <w:sz w:val="18"/>
-                <w:szCs w:val="18"/>
-                <w:lang w:eastAsia="zh-TW"/>
-              </w:rPr>
-            </w:pPr>
-            <w:r>
-              <w:rPr>
-                <w:rFonts w:ascii="Arial" w:hAnsi="Arial" w:cs="Arial"/>
-                <w:sz w:val="18"/>
-                <w:szCs w:val="18"/>
-                <w:lang w:eastAsia="zh-TW"/>
-              </w:rPr>
-              <w:t xml:space="preserve"> </w:t>
-            </w:r>
-            <w:r>
-              <w:rPr>
-                <w:rFonts w:ascii="Arial" w:hAnsi="PMingLiU" w:cs="Arial"/>
-                <w:sz w:val="18"/>
-                <w:szCs w:val="18"/>
-                <w:lang w:eastAsia="zh-CN"/>
-              </w:rPr>
-              <w:t>联络</w:t>
-            </w:r>
-            <w:r>
-              <w:rPr>
-                <w:rFonts w:ascii="Arial" w:hAnsi="PMingLiU" w:cs="Arial"/>
-                <w:sz w:val="18"/>
-                <w:szCs w:val="18"/>
-                <w:lang w:eastAsia="zh-TW"/>
-              </w:rPr>
-              <w:t>人</w:t>
-            </w:r>
-            <w:r>
-              <w:rPr>
-                <w:rFonts w:ascii="Arial" w:hAnsi="Arial" w:cs="Arial"/>
-                <w:sz w:val="18"/>
-                <w:szCs w:val="18"/>
-                <w:lang w:eastAsia="zh-TW"/>
-              </w:rPr>
-              <w:tab/>
-            </w:r>
-          </w:p>
-        </w:tc>
-        <w:tc>
-          <w:tcPr>
-            <w:tcW w:w="1525" w:type="dxa"/>
+              </w:rPr>
+              <w:t>：</w:t>
+            </w:r>
+            <w:r>
+              <w:rPr>
+                <w:rFonts w:ascii="Arial" w:hAnsi="Arial" w:cs="Arial" w:hint="eastAsia"/>
+                <w:sz w:val="18"/>
+                <w:szCs w:val="18"/>
+                <w:lang w:eastAsia="zh-CN"/>
+              </w:rPr>
+              <w:t>联系人</w:t>
+            </w:r>
+          </w:p>
+        </w:tc>
+        <w:tc>
+          <w:tcPr>
+            <w:tcW w:w="1890" w:type="dxa"/>
             <w:tcBorders>
               <w:bottom w:val="single" w:sz="4" w:space="0" w:color="auto"/>
             </w:tcBorders>
@@ -2841,7 +2782,7 @@
             <w:pPr>
               <w:spacing w:before="120"/>
               <w:rPr>
-                <w:rFonts w:ascii="Arial" w:hAnsi="Arial" w:cs="Arial"/>
+                <w:rFonts w:ascii="Arial" w:hAnsi="Arial" w:cs="Arial" w:hint="eastAsia"/>
                 <w:sz w:val="20"/>
                 <w:szCs w:val="20"/>
                 <w:lang w:eastAsia="zh-CN"/>
@@ -8232,8 +8173,11 @@
   </w:compat>
   <w:rsids>
     <w:rsidRoot w:val="00FB04C2"/>
-    <w:rsid w:val="00511E07"/>
+    <w:rsid w:val="00437D93"/>
+    <w:rsid w:val="004E2A31"/>
+    <w:rsid w:val="007F08BF"/>
     <w:rsid w:val="00E3788A"/>
+    <w:rsid w:val="00E663A8"/>
     <w:rsid w:val="00FB04C2"/>
   </w:rsids>
   <m:mathPr>
@@ -8695,34 +8639,6 @@
       <w:color w:val="808080"/>
     </w:rPr>
   </w:style>
-  <w:style w:type="paragraph" w:customStyle="1" w:styleId="7D06550033A64651B0AB341262A85E42">
-    <w:name w:val="7D06550033A64651B0AB341262A85E42"/>
-    <w:rsid w:val="00FB04C2"/>
-  </w:style>
-  <w:style w:type="paragraph" w:customStyle="1" w:styleId="F7B8F428F2194F28BC4FD45B6AE09EFA">
-    <w:name w:val="F7B8F428F2194F28BC4FD45B6AE09EFA"/>
-    <w:rsid w:val="00FB04C2"/>
-  </w:style>
-  <w:style w:type="paragraph" w:customStyle="1" w:styleId="42F6CDFAC0234BFB943422DB4732116B">
-    <w:name w:val="42F6CDFAC0234BFB943422DB4732116B"/>
-    <w:rsid w:val="00FB04C2"/>
-  </w:style>
-  <w:style w:type="paragraph" w:customStyle="1" w:styleId="4B4AAD1AAE3E4B73B9582ACA33D25800">
-    <w:name w:val="4B4AAD1AAE3E4B73B9582ACA33D25800"/>
-    <w:rsid w:val="00FB04C2"/>
-  </w:style>
-  <w:style w:type="paragraph" w:customStyle="1" w:styleId="ADB067825581465DA96D33C765D69FFA">
-    <w:name w:val="ADB067825581465DA96D33C765D69FFA"/>
-    <w:rsid w:val="00FB04C2"/>
-  </w:style>
-  <w:style w:type="paragraph" w:customStyle="1" w:styleId="1B38330D89E34AB2B17FC2C3E94DE8D4">
-    <w:name w:val="1B38330D89E34AB2B17FC2C3E94DE8D4"/>
-    <w:rsid w:val="00FB04C2"/>
-  </w:style>
-  <w:style w:type="paragraph" w:customStyle="1" w:styleId="7C2504EA52804A918CCC6A70CA4C2502">
-    <w:name w:val="7C2504EA52804A918CCC6A70CA4C2502"/>
-    <w:rsid w:val="00FB04C2"/>
-  </w:style>
   <w:style w:type="paragraph" w:customStyle="1" w:styleId="ED2ECB8F7457488FB8240A0C549D3AB4">
     <w:name w:val="ED2ECB8F7457488FB8240A0C549D3AB4"/>
     <w:rsid w:val="00FB04C2"/>

</xml_diff>

<commit_message>
revise transparent to start from
</commit_message>
<xml_diff>
--- a/downloads/inspection-booking-form.docx
+++ b/downloads/inspection-booking-form.docx
@@ -152,7 +152,7 @@
       <w:pPr>
         <w:snapToGrid w:val="0"/>
         <w:rPr>
-          <w:rFonts w:ascii="Arial" w:hAnsi="Arial" w:cs="Arial" w:hint="eastAsia"/>
+          <w:rFonts w:ascii="Arial" w:hAnsi="Arial" w:cs="Arial"/>
           <w:sz w:val="18"/>
           <w:szCs w:val="18"/>
           <w:lang w:eastAsia="zh-CN"/>
@@ -413,7 +413,7 @@
       <w:pPr>
         <w:snapToGrid w:val="0"/>
         <w:rPr>
-          <w:rFonts w:ascii="Arial" w:hAnsi="Arial" w:cs="Arial" w:hint="eastAsia"/>
+          <w:rFonts w:ascii="Arial" w:hAnsi="Arial" w:cs="Arial"/>
           <w:sz w:val="20"/>
           <w:szCs w:val="20"/>
         </w:rPr>
@@ -431,9 +431,9 @@
       </w:tblPr>
       <w:tblGrid>
         <w:gridCol w:w="1440"/>
-        <w:gridCol w:w="4230"/>
-        <w:gridCol w:w="1980"/>
-        <w:gridCol w:w="2975"/>
+        <w:gridCol w:w="4140"/>
+        <w:gridCol w:w="2250"/>
+        <w:gridCol w:w="2795"/>
         <w:gridCol w:w="3147"/>
       </w:tblGrid>
       <w:tr>
@@ -470,7 +470,7 @@
         </w:tc>
         <w:tc>
           <w:tcPr>
-            <w:tcW w:w="4230" w:type="dxa"/>
+            <w:tcW w:w="4140" w:type="dxa"/>
             <w:tcBorders>
               <w:bottom w:val="single" w:sz="4" w:space="0" w:color="auto"/>
             </w:tcBorders>
@@ -479,7 +479,7 @@
           <w:p>
             <w:pPr>
               <w:rPr>
-                <w:rFonts w:ascii="Arial" w:hAnsi="Arial" w:cs="Arial" w:hint="eastAsia"/>
+                <w:rFonts w:ascii="Arial" w:hAnsi="Arial" w:cs="Arial"/>
                 <w:sz w:val="18"/>
                 <w:szCs w:val="18"/>
                 <w:lang w:eastAsia="zh-CN"/>
@@ -489,7 +489,7 @@
         </w:tc>
         <w:tc>
           <w:tcPr>
-            <w:tcW w:w="4955" w:type="dxa"/>
+            <w:tcW w:w="5045" w:type="dxa"/>
             <w:gridSpan w:val="2"/>
             <w:vAlign w:val="bottom"/>
           </w:tcPr>
@@ -607,7 +607,7 @@
             <w:pPr>
               <w:spacing w:before="120"/>
               <w:rPr>
-                <w:rFonts w:ascii="Arial" w:hAnsi="Arial" w:cs="Arial" w:hint="eastAsia"/>
+                <w:rFonts w:ascii="Arial" w:hAnsi="Arial" w:cs="Arial"/>
                 <w:sz w:val="18"/>
                 <w:szCs w:val="18"/>
                 <w:lang w:eastAsia="zh-CN"/>
@@ -694,7 +694,7 @@
         </w:tc>
         <w:tc>
           <w:tcPr>
-            <w:tcW w:w="4230" w:type="dxa"/>
+            <w:tcW w:w="4140" w:type="dxa"/>
             <w:tcBorders>
               <w:top w:val="single" w:sz="4" w:space="0" w:color="auto"/>
               <w:bottom w:val="single" w:sz="4" w:space="0" w:color="auto"/>
@@ -714,7 +714,7 @@
         </w:tc>
         <w:tc>
           <w:tcPr>
-            <w:tcW w:w="1980" w:type="dxa"/>
+            <w:tcW w:w="2250" w:type="dxa"/>
             <w:tcBorders>
               <w:top w:val="single" w:sz="4" w:space="0" w:color="auto"/>
             </w:tcBorders>
@@ -755,7 +755,7 @@
         </w:tc>
         <w:tc>
           <w:tcPr>
-            <w:tcW w:w="2975" w:type="dxa"/>
+            <w:tcW w:w="2795" w:type="dxa"/>
             <w:tcBorders>
               <w:top w:val="single" w:sz="4" w:space="0" w:color="auto"/>
               <w:bottom w:val="single" w:sz="4" w:space="0" w:color="auto"/>
@@ -814,7 +814,7 @@
         </w:tc>
         <w:tc>
           <w:tcPr>
-            <w:tcW w:w="4230" w:type="dxa"/>
+            <w:tcW w:w="4140" w:type="dxa"/>
             <w:tcBorders>
               <w:top w:val="single" w:sz="4" w:space="0" w:color="auto"/>
               <w:bottom w:val="single" w:sz="4" w:space="0" w:color="auto"/>
@@ -834,7 +834,7 @@
         </w:tc>
         <w:tc>
           <w:tcPr>
-            <w:tcW w:w="1980" w:type="dxa"/>
+            <w:tcW w:w="2250" w:type="dxa"/>
             <w:vAlign w:val="bottom"/>
           </w:tcPr>
           <w:p>
@@ -844,7 +844,7 @@
               </w:tabs>
               <w:spacing w:before="120"/>
               <w:rPr>
-                <w:rFonts w:ascii="Arial" w:hAnsi="Arial" w:cs="Arial" w:hint="eastAsia"/>
+                <w:rFonts w:ascii="Arial" w:hAnsi="Arial" w:cs="Arial"/>
                 <w:sz w:val="20"/>
                 <w:szCs w:val="20"/>
                 <w:lang w:eastAsia="zh-CN"/>
@@ -865,13 +865,31 @@
                 <w:szCs w:val="20"/>
                 <w:lang w:eastAsia="zh-CN"/>
               </w:rPr>
-              <w:t xml:space="preserve"> (if not by client):</w:t>
+              <w:t xml:space="preserve"> (if not</w:t>
             </w:r>
-          </w:p>
-        </w:tc>
-        <w:tc>
-          <w:tcPr>
-            <w:tcW w:w="2975" w:type="dxa"/>
+            <w:r>
+              <w:rPr>
+                <w:rFonts w:ascii="Arial" w:hAnsi="Arial" w:cs="Arial" w:hint="eastAsia"/>
+                <w:sz w:val="20"/>
+                <w:szCs w:val="20"/>
+                <w:lang w:eastAsia="zh-CN"/>
+              </w:rPr>
+              <w:t xml:space="preserve"> from </w:t>
+            </w:r>
+            <w:r>
+              <w:rPr>
+                <w:rFonts w:ascii="Arial" w:hAnsi="Arial" w:cs="Arial" w:hint="eastAsia"/>
+                <w:sz w:val="20"/>
+                <w:szCs w:val="20"/>
+                <w:lang w:eastAsia="zh-CN"/>
+              </w:rPr>
+              <w:t>client):</w:t>
+            </w:r>
+          </w:p>
+        </w:tc>
+        <w:tc>
+          <w:tcPr>
+            <w:tcW w:w="2795" w:type="dxa"/>
             <w:tcBorders>
               <w:bottom w:val="single" w:sz="4" w:space="0" w:color="auto"/>
             </w:tcBorders>
@@ -994,7 +1012,7 @@
             <w:pPr>
               <w:spacing w:before="120"/>
               <w:rPr>
-                <w:rFonts w:ascii="Arial" w:hAnsi="Arial" w:cs="Arial" w:hint="eastAsia"/>
+                <w:rFonts w:ascii="Arial" w:hAnsi="Arial" w:cs="Arial"/>
                 <w:sz w:val="20"/>
                 <w:szCs w:val="20"/>
                 <w:lang w:eastAsia="zh-CN"/>
@@ -1157,7 +1175,7 @@
               </w:tabs>
               <w:spacing w:before="120"/>
               <w:rPr>
-                <w:rFonts w:ascii="Arial" w:eastAsiaTheme="minorEastAsia" w:hAnsi="Arial" w:cs="Arial" w:hint="eastAsia"/>
+                <w:rFonts w:ascii="Arial" w:eastAsiaTheme="minorEastAsia" w:hAnsi="Arial" w:cs="Arial"/>
                 <w:sz w:val="20"/>
                 <w:szCs w:val="20"/>
                 <w:lang w:eastAsia="zh-CN"/>
@@ -1190,11 +1208,20 @@
             </w:pPr>
             <w:r>
               <w:rPr>
-                <w:rFonts w:ascii="Arial" w:hAnsi="Arial" w:cs="Arial"/>
-                <w:sz w:val="20"/>
-                <w:szCs w:val="20"/>
-              </w:rPr>
-              <w:t>Order No</w:t>
+                <w:rFonts w:ascii="Arial" w:hAnsi="Arial" w:cs="Arial" w:hint="eastAsia"/>
+                <w:sz w:val="20"/>
+                <w:szCs w:val="20"/>
+                <w:lang w:eastAsia="zh-CN"/>
+              </w:rPr>
+              <w:t>PO</w:t>
+            </w:r>
+            <w:r>
+              <w:rPr>
+                <w:rFonts w:ascii="Arial" w:hAnsi="Arial" w:cs="Arial"/>
+                <w:sz w:val="20"/>
+                <w:szCs w:val="20"/>
+              </w:rPr>
+              <w:t xml:space="preserve"> No</w:t>
             </w:r>
             <w:r>
               <w:rPr>
@@ -1319,7 +1346,7 @@
         <w:spacing w:line="264" w:lineRule="auto"/>
         <w:jc w:val="both"/>
         <w:rPr>
-          <w:rFonts w:ascii="Arial" w:hAnsi="Arial" w:cs="Arial" w:hint="eastAsia"/>
+          <w:rFonts w:ascii="Arial" w:hAnsi="Arial" w:cs="Arial"/>
           <w:sz w:val="20"/>
           <w:lang w:eastAsia="zh-CN"/>
         </w:rPr>
@@ -1483,7 +1510,7 @@
               <w:spacing w:before="120"/>
               <w:jc w:val="right"/>
               <w:rPr>
-                <w:rFonts w:ascii="Arial" w:hAnsi="Arial" w:cs="Arial" w:hint="eastAsia"/>
+                <w:rFonts w:ascii="Arial" w:hAnsi="Arial" w:cs="Arial"/>
                 <w:sz w:val="20"/>
                 <w:szCs w:val="20"/>
                 <w:lang w:eastAsia="zh-CN"/>
@@ -1514,7 +1541,7 @@
             <w:pPr>
               <w:spacing w:before="160"/>
               <w:rPr>
-                <w:rFonts w:ascii="Arial" w:eastAsia="PMingLiU" w:hAnsi="Arial" w:cs="Arial" w:hint="eastAsia"/>
+                <w:rFonts w:ascii="Arial" w:eastAsia="PMingLiU" w:hAnsi="Arial" w:cs="Arial"/>
                 <w:sz w:val="18"/>
                 <w:szCs w:val="18"/>
                 <w:lang w:eastAsia="zh-CN"/>
@@ -1570,7 +1597,7 @@
             <w:pPr>
               <w:spacing w:before="160"/>
               <w:rPr>
-                <w:rFonts w:ascii="Arial" w:hAnsi="Arial" w:cs="Arial" w:hint="eastAsia"/>
+                <w:rFonts w:ascii="Arial" w:hAnsi="Arial" w:cs="Arial"/>
                 <w:sz w:val="18"/>
                 <w:szCs w:val="18"/>
                 <w:lang w:eastAsia="zh-CN"/>
@@ -1664,7 +1691,7 @@
               <w:spacing w:before="120"/>
               <w:jc w:val="center"/>
               <w:rPr>
-                <w:rFonts w:ascii="Arial" w:hAnsi="Arial" w:cs="Arial" w:hint="eastAsia"/>
+                <w:rFonts w:ascii="Arial" w:hAnsi="Arial" w:cs="Arial"/>
                 <w:sz w:val="20"/>
                 <w:szCs w:val="20"/>
                 <w:lang w:eastAsia="zh-CN"/>
@@ -1694,7 +1721,7 @@
             <w:pPr>
               <w:spacing w:before="120"/>
               <w:rPr>
-                <w:rFonts w:ascii="Arial" w:hAnsi="Arial" w:cs="Arial" w:hint="eastAsia"/>
+                <w:rFonts w:ascii="Arial" w:hAnsi="Arial" w:cs="Arial"/>
                 <w:sz w:val="20"/>
                 <w:szCs w:val="20"/>
                 <w:lang w:eastAsia="zh-CN"/>
@@ -2350,6 +2377,74 @@
         <w:rPr>
           <w:rFonts w:ascii="Arial" w:hAnsi="Arial" w:cs="Arial"/>
           <w:b/>
+          <w:lang w:eastAsia="zh-CN"/>
+        </w:rPr>
+      </w:pPr>
+    </w:p>
+    <w:p>
+      <w:pPr>
+        <w:rPr>
+          <w:rFonts w:ascii="Arial" w:hAnsi="Arial" w:cs="Arial"/>
+          <w:bCs/>
+          <w:lang w:eastAsia="zh-CN"/>
+        </w:rPr>
+      </w:pPr>
+      <w:r>
+        <w:rPr>
+          <w:rFonts w:ascii="Arial" w:hAnsi="Arial" w:cs="Arial"/>
+          <w:bCs/>
+          <w:lang w:eastAsia="zh-CN"/>
+        </w:rPr>
+        <w:t xml:space="preserve">Please submit this booking to </w:t>
+      </w:r>
+      <w:hyperlink r:id="rId11" w:history="1">
+        <w:r>
+          <w:rPr>
+            <w:rStyle w:val="Hyperlink"/>
+            <w:rFonts w:ascii="Arial" w:hAnsi="Arial" w:cs="Arial"/>
+            <w:bCs/>
+            <w:lang w:eastAsia="zh-CN"/>
+          </w:rPr>
+          <w:t>planning@cn-q.com</w:t>
+        </w:r>
+      </w:hyperlink>
+      <w:r>
+        <w:rPr>
+          <w:rFonts w:ascii="Arial" w:hAnsi="Arial" w:cs="Arial"/>
+          <w:bCs/>
+          <w:lang w:eastAsia="zh-CN"/>
+        </w:rPr>
+        <w:t>.</w:t>
+      </w:r>
+      <w:r>
+        <w:rPr>
+          <w:bCs/>
+        </w:rPr>
+        <w:t xml:space="preserve"> </w:t>
+      </w:r>
+      <w:r>
+        <w:rPr>
+          <w:rFonts w:ascii="Arial" w:hAnsi="Arial" w:cs="Arial"/>
+          <w:bCs/>
+          <w:lang w:eastAsia="zh-CN"/>
+        </w:rPr>
+        <w:t>Our team will process your request and send a notification email within 12 hours</w:t>
+      </w:r>
+    </w:p>
+    <w:p>
+      <w:pPr>
+        <w:rPr>
+          <w:rFonts w:ascii="Arial" w:hAnsi="Arial" w:cs="Arial"/>
+          <w:b/>
+          <w:lang w:eastAsia="zh-CN"/>
+        </w:rPr>
+      </w:pPr>
+    </w:p>
+    <w:p>
+      <w:pPr>
+        <w:rPr>
+          <w:rFonts w:ascii="Arial" w:hAnsi="Arial" w:cs="Arial"/>
+          <w:b/>
           <w:bCs/>
           <w:lang w:eastAsia="zh-TW"/>
         </w:rPr>
@@ -3295,7 +3390,7 @@
     <w:p>
       <w:pPr>
         <w:rPr>
-          <w:rFonts w:ascii="Arial" w:hAnsi="Arial" w:cs="Arial" w:hint="eastAsia"/>
+          <w:rFonts w:ascii="Arial" w:hAnsi="Arial" w:cs="Arial"/>
           <w:spacing w:val="-2"/>
           <w:sz w:val="16"/>
           <w:lang w:eastAsia="zh-CN"/>
@@ -3697,7 +3792,7 @@
           <w:p>
             <w:pPr>
               <w:rPr>
-                <w:rFonts w:ascii="Arial" w:hAnsi="Arial" w:cs="Arial" w:hint="eastAsia"/>
+                <w:rFonts w:ascii="Arial" w:hAnsi="Arial" w:cs="Arial"/>
                 <w:sz w:val="20"/>
                 <w:szCs w:val="20"/>
                 <w:lang w:eastAsia="zh-CN"/>
@@ -3730,7 +3825,7 @@
           <w:p>
             <w:pPr>
               <w:rPr>
-                <w:rFonts w:ascii="Arial" w:hAnsi="Arial" w:cs="Arial" w:hint="eastAsia"/>
+                <w:rFonts w:ascii="Arial" w:hAnsi="Arial" w:cs="Arial"/>
                 <w:sz w:val="20"/>
                 <w:szCs w:val="20"/>
                 <w:lang w:eastAsia="zh-CN"/>
@@ -3796,7 +3891,7 @@
           <w:p>
             <w:pPr>
               <w:rPr>
-                <w:rFonts w:ascii="Arial" w:hAnsi="Arial" w:cs="Arial" w:hint="eastAsia"/>
+                <w:rFonts w:ascii="Arial" w:hAnsi="Arial" w:cs="Arial"/>
                 <w:sz w:val="20"/>
                 <w:szCs w:val="20"/>
                 <w:lang w:eastAsia="zh-CN"/>
@@ -4448,7 +4543,7 @@
           <w:p>
             <w:pPr>
               <w:rPr>
-                <w:rFonts w:ascii="Arial" w:hAnsi="Arial" w:cs="Arial" w:hint="eastAsia"/>
+                <w:rFonts w:ascii="Arial" w:hAnsi="Arial" w:cs="Arial"/>
                 <w:sz w:val="18"/>
                 <w:szCs w:val="18"/>
                 <w:lang w:eastAsia="zh-CN"/>
@@ -4537,7 +4632,7 @@
           <w:p>
             <w:pPr>
               <w:rPr>
-                <w:rFonts w:ascii="Arial" w:hAnsi="Arial" w:cs="Arial" w:hint="eastAsia"/>
+                <w:rFonts w:ascii="Arial" w:hAnsi="Arial" w:cs="Arial"/>
                 <w:sz w:val="18"/>
                 <w:szCs w:val="18"/>
                 <w:lang w:eastAsia="zh-CN"/>
@@ -4727,9 +4822,9 @@
       </w:r>
     </w:p>
     <w:sectPr>
-      <w:headerReference w:type="even" r:id="rId11"/>
-      <w:headerReference w:type="default" r:id="rId12"/>
-      <w:headerReference w:type="first" r:id="rId13"/>
+      <w:headerReference w:type="even" r:id="rId12"/>
+      <w:headerReference w:type="default" r:id="rId13"/>
+      <w:headerReference w:type="first" r:id="rId14"/>
       <w:type w:val="continuous"/>
       <w:pgSz w:w="11909" w:h="16834" w:code="9"/>
       <w:pgMar w:top="245" w:right="605" w:bottom="29" w:left="605" w:header="288" w:footer="72" w:gutter="0"/>
@@ -4802,7 +4897,7 @@
         <w:szCs w:val="20"/>
         <w:lang w:eastAsia="zh-CN"/>
       </w:rPr>
-      <w:t>cn-Q</w:t>
+      <w:t>ChinaQualityService.</w:t>
     </w:r>
     <w:r>
       <w:rPr>
@@ -4811,7 +4906,7 @@
         <w:szCs w:val="20"/>
         <w:lang w:eastAsia="zh-CN"/>
       </w:rPr>
-      <w:t>.com</w:t>
+      <w:t>com</w:t>
     </w:r>
     <w:r>
       <w:rPr>
@@ -6716,6 +6811,18 @@
       <w:color w:val="808080"/>
     </w:rPr>
   </w:style>
+  <w:style w:type="character" w:styleId="UnresolvedMention">
+    <w:name w:val="Unresolved Mention"/>
+    <w:basedOn w:val="DefaultParagraphFont"/>
+    <w:uiPriority w:val="99"/>
+    <w:semiHidden/>
+    <w:unhideWhenUsed/>
+    <w:rsid w:val="005B6601"/>
+    <w:rPr>
+      <w:color w:val="605E5C"/>
+      <w:shd w:val="clear" w:color="auto" w:fill="E1DFDD"/>
+    </w:rPr>
+  </w:style>
 </w:styles>
 </file>
 
@@ -6987,11 +7094,20 @@
   </w:compat>
   <w:rsids>
     <w:rsidRoot w:val="00FB04C2"/>
+    <w:rsid w:val="000B4EA1"/>
+    <w:rsid w:val="00177E55"/>
+    <w:rsid w:val="001C41EC"/>
     <w:rsid w:val="001D5E02"/>
+    <w:rsid w:val="002F1BD6"/>
+    <w:rsid w:val="0036005E"/>
     <w:rsid w:val="00437D93"/>
     <w:rsid w:val="004E2A31"/>
+    <w:rsid w:val="00662E8C"/>
+    <w:rsid w:val="0074331C"/>
+    <w:rsid w:val="007D2148"/>
+    <w:rsid w:val="007E2317"/>
     <w:rsid w:val="00832033"/>
-    <w:rsid w:val="00920A3C"/>
+    <w:rsid w:val="0091424E"/>
     <w:rsid w:val="00B23B4E"/>
     <w:rsid w:val="00E3788A"/>
     <w:rsid w:val="00E663A8"/>
@@ -7456,20 +7572,8 @@
       <w:color w:val="808080"/>
     </w:rPr>
   </w:style>
-  <w:style w:type="paragraph" w:customStyle="1" w:styleId="ED2ECB8F7457488FB8240A0C549D3AB4">
-    <w:name w:val="ED2ECB8F7457488FB8240A0C549D3AB4"/>
-    <w:rsid w:val="00FB04C2"/>
-  </w:style>
-  <w:style w:type="paragraph" w:customStyle="1" w:styleId="55FDF9248FA24ED3925D58931BCE2D32">
-    <w:name w:val="55FDF9248FA24ED3925D58931BCE2D32"/>
-    <w:rsid w:val="001D5E02"/>
-  </w:style>
   <w:style w:type="paragraph" w:customStyle="1" w:styleId="2B11D07DDFFB4A01807F8F267A8B3506">
     <w:name w:val="2B11D07DDFFB4A01807F8F267A8B3506"/>
-    <w:rsid w:val="001D5E02"/>
-  </w:style>
-  <w:style w:type="paragraph" w:customStyle="1" w:styleId="A3E5A8B6564D41BDAA0BC743AFFFACCB">
-    <w:name w:val="A3E5A8B6564D41BDAA0BC743AFFFACCB"/>
     <w:rsid w:val="001D5E02"/>
   </w:style>
   <w:style w:type="paragraph" w:customStyle="1" w:styleId="717DF14105DE432592A456520CB6356E">
@@ -7478,34 +7582,6 @@
   </w:style>
   <w:style w:type="paragraph" w:customStyle="1" w:styleId="A65B704BA35749EE99CD09A213645783">
     <w:name w:val="A65B704BA35749EE99CD09A213645783"/>
-    <w:rsid w:val="001D5E02"/>
-  </w:style>
-  <w:style w:type="paragraph" w:customStyle="1" w:styleId="CE27058A63A641A6AB44D1A0BD02E11A">
-    <w:name w:val="CE27058A63A641A6AB44D1A0BD02E11A"/>
-    <w:rsid w:val="001D5E02"/>
-  </w:style>
-  <w:style w:type="paragraph" w:customStyle="1" w:styleId="0E8255182F2D40D790DB5B2EB14A868A">
-    <w:name w:val="0E8255182F2D40D790DB5B2EB14A868A"/>
-    <w:rsid w:val="001D5E02"/>
-  </w:style>
-  <w:style w:type="paragraph" w:customStyle="1" w:styleId="191BC3F1523546D29DBF534714BDDC52">
-    <w:name w:val="191BC3F1523546D29DBF534714BDDC52"/>
-    <w:rsid w:val="001D5E02"/>
-  </w:style>
-  <w:style w:type="paragraph" w:customStyle="1" w:styleId="C813D075435F49C2B6E084FCC4FD1177">
-    <w:name w:val="C813D075435F49C2B6E084FCC4FD1177"/>
-    <w:rsid w:val="001D5E02"/>
-  </w:style>
-  <w:style w:type="paragraph" w:customStyle="1" w:styleId="4012E3B6C68546B0ACE719B9A069D231">
-    <w:name w:val="4012E3B6C68546B0ACE719B9A069D231"/>
-    <w:rsid w:val="001D5E02"/>
-  </w:style>
-  <w:style w:type="paragraph" w:customStyle="1" w:styleId="7C4A414818354D3092775862749BBC43">
-    <w:name w:val="7C4A414818354D3092775862749BBC43"/>
-    <w:rsid w:val="001D5E02"/>
-  </w:style>
-  <w:style w:type="paragraph" w:customStyle="1" w:styleId="3187544EA30742778C9B478B447D8DCF">
-    <w:name w:val="3187544EA30742778C9B478B447D8DCF"/>
     <w:rsid w:val="001D5E02"/>
   </w:style>
   <w:style w:type="paragraph" w:customStyle="1" w:styleId="5E448AE445CB46D0BFF1F3A3960B71D9">

</xml_diff>